<commit_message>
refactor(inventory): hapus signals dan sentralisasi logika packing ke services
- Hapus signals.py untuk mencegah double deduction dan tabrakan transaksi
- Bersihkan percobaan update atribut virtual sisa_stok pada Batch
- Persiapan transisi pelacakan saldo dari level Batch ke level Tangki
</commit_message>
<xml_diff>
--- a/pracindo_backend_v1/fitur/templates/stikerbesarpolos.docx
+++ b/pracindo_backend_v1/fitur/templates/stikerbesarpolos.docx
@@ -30,7 +30,7 @@
       </w:tblGrid>
       <w:tr>
         <w:trPr>
-          <w:trHeight w:hRule="exact" w:val="5014"/>
+          <w:trHeight w:hRule="exact" w:val="20"/>
         </w:trPr>
         <w:tc>
           <w:tcPr>
@@ -38,256 +38,261 @@
             <w:vAlign w:val="center"/>
           </w:tcPr>
           <w:p>
+            <w:pPr>
+              <w:rPr>
+                <w:rFonts w:ascii="Aptos Black" w:hAnsi="Aptos Black"/>
+                <w:b/>
+                <w:bCs/>
+                <w:sz w:val="2"/>
+                <w:szCs w:val="2"/>
+              </w:rPr>
+            </w:pPr>
             <w:r>
               <w:rPr>
-                <w:noProof/>
-                <w:lang w:val="en-US"/>
+                <w:rFonts w:ascii="Aptos Black" w:hAnsi="Aptos Black"/>
+                <w:b/>
+                <w:bCs/>
+                <w:sz w:val="2"/>
+                <w:szCs w:val="2"/>
               </w:rPr>
-              <mc:AlternateContent>
-                <mc:Choice Requires="wps">
-                  <w:drawing>
-                    <wp:anchor distT="0" distB="0" distL="114300" distR="114300" simplePos="0" relativeHeight="251666432" behindDoc="0" locked="0" layoutInCell="1" allowOverlap="1" wp14:anchorId="3FF87A4A" wp14:editId="7D108187">
-                      <wp:simplePos x="0" y="0"/>
-                      <wp:positionH relativeFrom="margin">
-                        <wp:posOffset>41910</wp:posOffset>
-                      </wp:positionH>
-                      <wp:positionV relativeFrom="paragraph">
-                        <wp:posOffset>-6985</wp:posOffset>
-                      </wp:positionV>
-                      <wp:extent cx="7612380" cy="3124200"/>
-                      <wp:effectExtent l="19050" t="19050" r="45720" b="57150"/>
-                      <wp:wrapNone/>
-                      <wp:docPr id="1032794923" name="AutoShape 213"/>
-                      <wp:cNvGraphicFramePr>
-                        <a:graphicFrameLocks xmlns:a="http://schemas.openxmlformats.org/drawingml/2006/main" noChangeAspect="1"/>
-                      </wp:cNvGraphicFramePr>
-                      <a:graphic xmlns:a="http://schemas.openxmlformats.org/drawingml/2006/main">
-                        <a:graphicData uri="http://schemas.microsoft.com/office/word/2010/wordprocessingShape">
-                          <wps:wsp>
-                            <wps:cNvSpPr>
-                              <a:spLocks noChangeAspect="1" noChangeArrowheads="1"/>
-                            </wps:cNvSpPr>
-                            <wps:spPr bwMode="auto">
-                              <a:xfrm>
-                                <a:off x="0" y="0"/>
-                                <a:ext cx="7612380" cy="3124200"/>
-                              </a:xfrm>
-                              <a:prstGeom prst="roundRect">
-                                <a:avLst>
-                                  <a:gd name="adj" fmla="val 16667"/>
-                                </a:avLst>
-                              </a:prstGeom>
-                              <a:gradFill rotWithShape="0">
-                                <a:gsLst>
-                                  <a:gs pos="0">
-                                    <a:srgbClr val="C6D9F1"/>
-                                  </a:gs>
-                                  <a:gs pos="100000">
-                                    <a:srgbClr val="C6D9F1">
-                                      <a:gamma/>
-                                      <a:tint val="20000"/>
-                                      <a:invGamma/>
-                                    </a:srgbClr>
-                                  </a:gs>
-                                </a:gsLst>
-                                <a:lin ang="5400000" scaled="1"/>
-                              </a:gradFill>
-                              <a:ln w="38100">
-                                <a:solidFill>
-                                  <a:srgbClr val="F2F2F2"/>
-                                </a:solidFill>
-                                <a:round/>
-                                <a:headEnd/>
-                                <a:tailEnd/>
-                              </a:ln>
-                              <a:effectLst>
-                                <a:outerShdw dist="28398" dir="3806097" algn="ctr" rotWithShape="0">
-                                  <a:srgbClr val="244482">
-                                    <a:alpha val="50000"/>
-                                  </a:srgbClr>
-                                </a:outerShdw>
-                              </a:effectLst>
-                            </wps:spPr>
-                            <wps:txbx>
-                              <w:txbxContent>
-                                <w:p>
-                                  <w:pPr>
-                                    <w:jc w:val="center"/>
-                                    <w:rPr>
-                                      <w:rFonts w:ascii="Aptos Black" w:hAnsi="Aptos Black"/>
-                                      <w:b/>
-                                      <w:bCs/>
-                                      <w:sz w:val="92"/>
-                                      <w:szCs w:val="92"/>
-                                    </w:rPr>
-                                  </w:pPr>
-                                  <w:r>
-                                    <w:rPr>
-                                      <w:rFonts w:ascii="Aptos Black" w:hAnsi="Aptos Black"/>
-                                      <w:b/>
-                                      <w:bCs/>
-                                      <w:sz w:val="92"/>
-                                      <w:szCs w:val="92"/>
-                                    </w:rPr>
-                                    <w:t xml:space="preserve">{{ </w:t>
-                                  </w:r>
-                                  <w:proofErr w:type="spellStart"/>
-                                  <w:r>
-                                    <w:rPr>
-                                      <w:rFonts w:ascii="Aptos Black" w:hAnsi="Aptos Black"/>
-                                      <w:b/>
-                                      <w:bCs/>
-                                      <w:sz w:val="92"/>
-                                      <w:szCs w:val="92"/>
-                                    </w:rPr>
-                                    <w:t>item.NAMA</w:t>
-                                  </w:r>
-                                  <w:proofErr w:type="spellEnd"/>
-                                  <w:r>
-                                    <w:rPr>
-                                      <w:rFonts w:ascii="Aptos Black" w:hAnsi="Aptos Black"/>
-                                      <w:b/>
-                                      <w:bCs/>
-                                      <w:sz w:val="92"/>
-                                      <w:szCs w:val="92"/>
-                                    </w:rPr>
-                                    <w:t xml:space="preserve"> }}</w:t>
-                                  </w:r>
-                                </w:p>
-                                <w:p>
-                                  <w:pPr>
-                                    <w:ind w:left="720"/>
-                                    <w:rPr>
-                                      <w:rFonts w:cs="Calibri"/>
-                                      <w:b/>
-                                      <w:bCs/>
-                                      <w:sz w:val="48"/>
-                                      <w:szCs w:val="48"/>
-                                    </w:rPr>
-                                  </w:pPr>
-                                  <w:r>
-                                    <w:rPr>
-                                      <w:rFonts w:cs="Calibri"/>
-                                      <w:b/>
-                                      <w:bCs/>
-                                      <w:sz w:val="48"/>
-                                      <w:szCs w:val="48"/>
-                                    </w:rPr>
-                                    <w:t xml:space="preserve">TYPE : ..............................{{ </w:t>
-                                  </w:r>
-                                  <w:proofErr w:type="spellStart"/>
-                                  <w:r>
-                                    <w:rPr>
-                                      <w:rFonts w:cs="Calibri"/>
-                                      <w:b/>
-                                      <w:bCs/>
-                                      <w:sz w:val="48"/>
-                                      <w:szCs w:val="48"/>
-                                    </w:rPr>
-                                    <w:t>item.TYPE</w:t>
-                                  </w:r>
-                                  <w:proofErr w:type="spellEnd"/>
-                                  <w:r>
-                                    <w:rPr>
-                                      <w:rFonts w:cs="Calibri"/>
-                                      <w:b/>
-                                      <w:bCs/>
-                                      <w:sz w:val="48"/>
-                                      <w:szCs w:val="48"/>
-                                    </w:rPr>
-                                    <w:t xml:space="preserve"> }}..................................</w:t>
-                                  </w:r>
-                                </w:p>
-                                <w:p>
-                                  <w:pPr>
-                                    <w:ind w:left="720"/>
-                                    <w:rPr>
-                                      <w:rFonts w:cs="Calibri"/>
-                                      <w:b/>
-                                      <w:bCs/>
-                                      <w:sz w:val="48"/>
-                                      <w:szCs w:val="48"/>
-                                    </w:rPr>
-                                  </w:pPr>
-                                  <w:r>
-                                    <w:rPr>
-                                      <w:rFonts w:cs="Calibri"/>
-                                      <w:b/>
-                                      <w:bCs/>
-                                      <w:sz w:val="48"/>
-                                      <w:szCs w:val="48"/>
-                                    </w:rPr>
-                                    <w:t xml:space="preserve">LOT  : ......................... {{ </w:t>
-                                  </w:r>
-                                  <w:proofErr w:type="spellStart"/>
-                                  <w:r>
-                                    <w:rPr>
-                                      <w:rFonts w:cs="Calibri"/>
-                                      <w:b/>
-                                      <w:bCs/>
-                                      <w:sz w:val="48"/>
-                                      <w:szCs w:val="48"/>
-                                    </w:rPr>
-                                    <w:t>item.LOT</w:t>
-                                  </w:r>
-                                  <w:proofErr w:type="spellEnd"/>
-                                  <w:r>
-                                    <w:rPr>
-                                      <w:rFonts w:cs="Calibri"/>
-                                      <w:b/>
-                                      <w:bCs/>
-                                      <w:sz w:val="48"/>
-                                      <w:szCs w:val="48"/>
-                                    </w:rPr>
-                                    <w:t xml:space="preserve"> }}...........................</w:t>
-                                  </w:r>
-                                </w:p>
-                                <w:p>
-                                  <w:pPr>
-                                    <w:ind w:left="720"/>
-                                    <w:rPr>
-                                      <w:rFonts w:cs="Calibri"/>
-                                      <w:b/>
-                                      <w:bCs/>
-                                      <w:sz w:val="48"/>
-                                      <w:szCs w:val="48"/>
-                                    </w:rPr>
-                                  </w:pPr>
-                                  <w:r>
-                                    <w:rPr>
-                                      <w:rFonts w:cs="Calibri"/>
-                                      <w:b/>
-                                      <w:bCs/>
-                                      <w:sz w:val="48"/>
-                                      <w:szCs w:val="48"/>
-                                    </w:rPr>
-                                    <w:t>NET  : ............................... {{ item.NET }}............................ KGS</w:t>
-                                  </w:r>
-                                </w:p>
-                              </w:txbxContent>
-                            </wps:txbx>
-                            <wps:bodyPr rot="0" vert="horz" wrap="square" lIns="91440" tIns="45720" rIns="91440" bIns="45720" anchor="t" anchorCtr="0" upright="1">
-                              <a:noAutofit/>
-                            </wps:bodyPr>
-                          </wps:wsp>
-                        </a:graphicData>
-                      </a:graphic>
-                      <wp14:sizeRelH relativeFrom="page">
-                        <wp14:pctWidth>0</wp14:pctWidth>
-                      </wp14:sizeRelH>
-                      <wp14:sizeRelV relativeFrom="page">
-                        <wp14:pctHeight>0</wp14:pctHeight>
-                      </wp14:sizeRelV>
-                    </wp:anchor>
-                  </w:drawing>
-                </mc:Choice>
-                <mc:Fallback>
-                  <w:pict>
-                    <v:roundrect w14:anchorId="3FF87A4A" id="AutoShape 213" o:spid="_x0000_s1026" style="position:absolute;margin-left:3.3pt;margin-top:-.55pt;width:599.4pt;height:246pt;z-index:251666432;visibility:visible;mso-wrap-style:square;mso-width-percent:0;mso-height-percent:0;mso-wrap-distance-left:9pt;mso-wrap-distance-top:0;mso-wrap-distance-right:9pt;mso-wrap-distance-bottom:0;mso-position-horizontal:absolute;mso-position-horizontal-relative:margin;mso-position-vertical:absolute;mso-position-vertical-relative:text;mso-width-percent:0;mso-height-percent:0;mso-width-relative:page;mso-height-relative:page;v-text-anchor:top" arcsize="10923f" o:gfxdata="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" fillcolor="#c6d9f1" strokecolor="#f2f2f2" strokeweight="3pt">
-                      <v:fill color2="#f4f7fc" focus="100%" type="gradient"/>
-                      <v:shadow on="t" color="#244482" opacity=".5" offset="1pt"/>
-                      <o:lock v:ext="edit" aspectratio="t"/>
-                      <v:textbox>
+              <w:t>{%</w:t>
+            </w:r>
+            <w:proofErr w:type="spellStart"/>
+            <w:r>
+              <w:rPr>
+                <w:rFonts w:ascii="Aptos Black" w:hAnsi="Aptos Black"/>
+                <w:b/>
+                <w:bCs/>
+                <w:sz w:val="2"/>
+                <w:szCs w:val="2"/>
+              </w:rPr>
+              <w:t>tr</w:t>
+            </w:r>
+            <w:proofErr w:type="spellEnd"/>
+            <w:r>
+              <w:rPr>
+                <w:rFonts w:ascii="Aptos Black" w:hAnsi="Aptos Black"/>
+                <w:b/>
+                <w:bCs/>
+                <w:sz w:val="2"/>
+                <w:szCs w:val="2"/>
+              </w:rPr>
+              <w:t xml:space="preserve"> </w:t>
+            </w:r>
+            <w:proofErr w:type="spellStart"/>
+            <w:r>
+              <w:rPr>
+                <w:rFonts w:ascii="Aptos Black" w:hAnsi="Aptos Black"/>
+                <w:b/>
+                <w:bCs/>
+                <w:sz w:val="2"/>
+                <w:szCs w:val="2"/>
+              </w:rPr>
+              <w:t>for</w:t>
+            </w:r>
+            <w:proofErr w:type="spellEnd"/>
+            <w:r>
+              <w:rPr>
+                <w:rFonts w:ascii="Aptos Black" w:hAnsi="Aptos Black"/>
+                <w:b/>
+                <w:bCs/>
+                <w:sz w:val="2"/>
+                <w:szCs w:val="2"/>
+              </w:rPr>
+              <w:t xml:space="preserve"> item in </w:t>
+            </w:r>
+            <w:proofErr w:type="spellStart"/>
+            <w:r>
+              <w:rPr>
+                <w:rFonts w:ascii="Aptos Black" w:hAnsi="Aptos Black"/>
+                <w:b/>
+                <w:bCs/>
+                <w:sz w:val="2"/>
+                <w:szCs w:val="2"/>
+              </w:rPr>
+              <w:t>items</w:t>
+            </w:r>
+            <w:proofErr w:type="spellEnd"/>
+            <w:r>
+              <w:rPr>
+                <w:rFonts w:ascii="Aptos Black" w:hAnsi="Aptos Black"/>
+                <w:b/>
+                <w:bCs/>
+                <w:sz w:val="2"/>
+                <w:szCs w:val="2"/>
+              </w:rPr>
+              <w:t xml:space="preserve"> %}</w:t>
+            </w:r>
+          </w:p>
+        </w:tc>
+      </w:tr>
+      <w:tr>
+        <w:trPr>
+          <w:trHeight w:hRule="exact" w:val="5014"/>
+        </w:trPr>
+        <w:tc>
+          <w:tcPr>
+            <w:tcW w:w="12268" w:type="dxa"/>
+            <w:tcBorders>
+              <w:bottom w:val="single" w:sz="4" w:space="0" w:color="auto"/>
+            </w:tcBorders>
+            <w:vAlign w:val="center"/>
+          </w:tcPr>
+          <w:p>
+            <w:pPr>
+              <w:rPr>
+                <w:rFonts w:ascii="Aptos Black" w:hAnsi="Aptos Black"/>
+                <w:b/>
+                <w:bCs/>
+                <w:sz w:val="20"/>
+                <w:szCs w:val="20"/>
+              </w:rPr>
+            </w:pPr>
+          </w:p>
+          <w:p/>
+        </w:tc>
+      </w:tr>
+      <w:tr>
+        <w:trPr>
+          <w:trHeight w:hRule="exact" w:val="20"/>
+        </w:trPr>
+        <w:tc>
+          <w:tcPr>
+            <w:tcW w:w="12268" w:type="dxa"/>
+            <w:tcBorders>
+              <w:top w:val="single" w:sz="4" w:space="0" w:color="auto"/>
+              <w:left w:val="nil"/>
+              <w:bottom w:val="nil"/>
+              <w:right w:val="nil"/>
+            </w:tcBorders>
+            <w:vAlign w:val="center"/>
+          </w:tcPr>
+          <w:p>
+            <w:pPr>
+              <w:rPr>
+                <w:rFonts w:ascii="Aptos Black" w:hAnsi="Aptos Black"/>
+                <w:b/>
+                <w:bCs/>
+                <w:sz w:val="2"/>
+                <w:szCs w:val="2"/>
+              </w:rPr>
+            </w:pPr>
+            <w:r>
+              <w:rPr>
+                <w:rFonts w:ascii="Aptos Black" w:hAnsi="Aptos Black"/>
+                <w:b/>
+                <w:bCs/>
+                <w:sz w:val="2"/>
+                <w:szCs w:val="2"/>
+              </w:rPr>
+              <w:t>{%</w:t>
+            </w:r>
+            <w:proofErr w:type="spellStart"/>
+            <w:r>
+              <w:rPr>
+                <w:rFonts w:ascii="Aptos Black" w:hAnsi="Aptos Black"/>
+                <w:b/>
+                <w:bCs/>
+                <w:sz w:val="2"/>
+                <w:szCs w:val="2"/>
+              </w:rPr>
+              <w:t>endfor</w:t>
+            </w:r>
+            <w:proofErr w:type="spellEnd"/>
+            <w:r>
+              <w:rPr>
+                <w:rFonts w:ascii="Aptos Black" w:hAnsi="Aptos Black"/>
+                <w:b/>
+                <w:bCs/>
+                <w:sz w:val="2"/>
+                <w:szCs w:val="2"/>
+              </w:rPr>
+              <w:t>%}</w:t>
+            </w:r>
+          </w:p>
+        </w:tc>
+      </w:tr>
+    </w:tbl>
+    <w:p>
+      <w:pPr>
+        <w:spacing w:line="240" w:lineRule="auto"/>
+        <w:rPr>
+          <w:b/>
+          <w:sz w:val="18"/>
+          <w:szCs w:val="18"/>
+        </w:rPr>
+      </w:pPr>
+      <w:r>
+        <w:rPr>
+          <w:noProof/>
+          <w:lang w:val="en-US"/>
+        </w:rPr>
+        <mc:AlternateContent>
+          <mc:Choice Requires="wps">
+            <w:drawing>
+              <wp:anchor distT="0" distB="0" distL="114300" distR="114300" simplePos="0" relativeHeight="251659264" behindDoc="0" locked="0" layoutInCell="1" allowOverlap="1" wp14:anchorId="51A78CDB" wp14:editId="4EDA99F0">
+                <wp:simplePos x="0" y="0"/>
+                <wp:positionH relativeFrom="margin">
+                  <wp:posOffset>117475</wp:posOffset>
+                </wp:positionH>
+                <wp:positionV relativeFrom="paragraph">
+                  <wp:posOffset>57785</wp:posOffset>
+                </wp:positionV>
+                <wp:extent cx="7543165" cy="3095625"/>
+                <wp:effectExtent l="19050" t="19050" r="38735" b="66675"/>
+                <wp:wrapNone/>
+                <wp:docPr id="1032794923" name="AutoShape 213"/>
+                <wp:cNvGraphicFramePr>
+                  <a:graphicFrameLocks xmlns:a="http://schemas.openxmlformats.org/drawingml/2006/main" noChangeAspect="1"/>
+                </wp:cNvGraphicFramePr>
+                <a:graphic xmlns:a="http://schemas.openxmlformats.org/drawingml/2006/main">
+                  <a:graphicData uri="http://schemas.microsoft.com/office/word/2010/wordprocessingShape">
+                    <wps:wsp>
+                      <wps:cNvSpPr>
+                        <a:spLocks noChangeAspect="1" noChangeArrowheads="1"/>
+                      </wps:cNvSpPr>
+                      <wps:spPr bwMode="auto">
+                        <a:xfrm>
+                          <a:off x="0" y="0"/>
+                          <a:ext cx="7543165" cy="3095625"/>
+                        </a:xfrm>
+                        <a:prstGeom prst="roundRect">
+                          <a:avLst>
+                            <a:gd name="adj" fmla="val 16667"/>
+                          </a:avLst>
+                        </a:prstGeom>
+                        <a:gradFill rotWithShape="0">
+                          <a:gsLst>
+                            <a:gs pos="0">
+                              <a:srgbClr val="C6D9F1"/>
+                            </a:gs>
+                            <a:gs pos="100000">
+                              <a:srgbClr val="C6D9F1">
+                                <a:gamma/>
+                                <a:tint val="20000"/>
+                                <a:invGamma/>
+                              </a:srgbClr>
+                            </a:gs>
+                          </a:gsLst>
+                          <a:lin ang="5400000" scaled="1"/>
+                        </a:gradFill>
+                        <a:ln w="38100">
+                          <a:solidFill>
+                            <a:srgbClr val="F2F2F2"/>
+                          </a:solidFill>
+                          <a:round/>
+                          <a:headEnd/>
+                          <a:tailEnd/>
+                        </a:ln>
+                        <a:effectLst>
+                          <a:outerShdw dist="28398" dir="3806097" algn="ctr" rotWithShape="0">
+                            <a:srgbClr val="244482">
+                              <a:alpha val="50000"/>
+                            </a:srgbClr>
+                          </a:outerShdw>
+                        </a:effectLst>
+                      </wps:spPr>
+                      <wps:txbx>
                         <w:txbxContent>
                           <w:p>
                             <w:pPr>
@@ -444,124 +449,192 @@
                             </w:r>
                           </w:p>
                         </w:txbxContent>
-                      </v:textbox>
-                      <w10:wrap anchorx="margin"/>
-                    </v:roundrect>
-                  </w:pict>
-                </mc:Fallback>
-              </mc:AlternateContent>
-            </w:r>
-            <w:r>
-              <w:rPr>
-                <w:rFonts w:ascii="Aptos Black" w:hAnsi="Aptos Black"/>
-                <w:b/>
-                <w:bCs/>
-                <w:sz w:val="20"/>
-                <w:szCs w:val="20"/>
-              </w:rPr>
-              <w:t>{%</w:t>
-            </w:r>
-            <w:proofErr w:type="spellStart"/>
-            <w:r>
-              <w:rPr>
-                <w:rFonts w:ascii="Aptos Black" w:hAnsi="Aptos Black"/>
-                <w:b/>
-                <w:bCs/>
-                <w:sz w:val="20"/>
-                <w:szCs w:val="20"/>
-              </w:rPr>
-              <w:t>tr</w:t>
-            </w:r>
-            <w:proofErr w:type="spellEnd"/>
-            <w:r>
-              <w:rPr>
-                <w:rFonts w:ascii="Aptos Black" w:hAnsi="Aptos Black"/>
-                <w:b/>
-                <w:bCs/>
-                <w:sz w:val="20"/>
-                <w:szCs w:val="20"/>
-              </w:rPr>
-              <w:t xml:space="preserve"> </w:t>
-            </w:r>
-            <w:proofErr w:type="spellStart"/>
-            <w:r>
-              <w:rPr>
-                <w:rFonts w:ascii="Aptos Black" w:hAnsi="Aptos Black"/>
-                <w:b/>
-                <w:bCs/>
-                <w:sz w:val="20"/>
-                <w:szCs w:val="20"/>
-              </w:rPr>
-              <w:t>for</w:t>
-            </w:r>
-            <w:proofErr w:type="spellEnd"/>
-            <w:r>
-              <w:rPr>
-                <w:rFonts w:ascii="Aptos Black" w:hAnsi="Aptos Black"/>
-                <w:b/>
-                <w:bCs/>
-                <w:sz w:val="20"/>
-                <w:szCs w:val="20"/>
-              </w:rPr>
-              <w:t xml:space="preserve"> item in </w:t>
-            </w:r>
-            <w:proofErr w:type="spellStart"/>
-            <w:r>
-              <w:rPr>
-                <w:rFonts w:ascii="Aptos Black" w:hAnsi="Aptos Black"/>
-                <w:b/>
-                <w:bCs/>
-                <w:sz w:val="20"/>
-                <w:szCs w:val="20"/>
-              </w:rPr>
-              <w:t>items</w:t>
-            </w:r>
-            <w:proofErr w:type="spellEnd"/>
-            <w:r>
-              <w:rPr>
-                <w:rFonts w:ascii="Aptos Black" w:hAnsi="Aptos Black"/>
-                <w:b/>
-                <w:bCs/>
-                <w:sz w:val="20"/>
-                <w:szCs w:val="20"/>
-              </w:rPr>
-              <w:t xml:space="preserve"> %}{%</w:t>
-            </w:r>
-            <w:proofErr w:type="spellStart"/>
-            <w:r>
-              <w:rPr>
-                <w:rFonts w:ascii="Aptos Black" w:hAnsi="Aptos Black"/>
-                <w:b/>
-                <w:bCs/>
-                <w:sz w:val="20"/>
-                <w:szCs w:val="20"/>
-              </w:rPr>
-              <w:t>endfor</w:t>
-            </w:r>
-            <w:proofErr w:type="spellEnd"/>
-            <w:r>
-              <w:rPr>
-                <w:rFonts w:ascii="Aptos Black" w:hAnsi="Aptos Black"/>
-                <w:b/>
-                <w:bCs/>
-                <w:sz w:val="20"/>
-                <w:szCs w:val="20"/>
-              </w:rPr>
-              <w:t>%}</w:t>
-            </w:r>
-          </w:p>
-        </w:tc>
-      </w:tr>
-    </w:tbl>
-    <w:p>
-      <w:pPr>
-        <w:spacing w:line="240" w:lineRule="auto"/>
-        <w:rPr>
-          <w:b/>
-          <w:sz w:val="18"/>
-          <w:szCs w:val="18"/>
-        </w:rPr>
-      </w:pPr>
+                      </wps:txbx>
+                      <wps:bodyPr rot="0" vert="horz" wrap="square" lIns="91440" tIns="45720" rIns="91440" bIns="45720" anchor="t" anchorCtr="0" upright="1">
+                        <a:noAutofit/>
+                      </wps:bodyPr>
+                    </wps:wsp>
+                  </a:graphicData>
+                </a:graphic>
+                <wp14:sizeRelH relativeFrom="page">
+                  <wp14:pctWidth>0</wp14:pctWidth>
+                </wp14:sizeRelH>
+                <wp14:sizeRelV relativeFrom="page">
+                  <wp14:pctHeight>0</wp14:pctHeight>
+                </wp14:sizeRelV>
+              </wp:anchor>
+            </w:drawing>
+          </mc:Choice>
+          <mc:Fallback>
+            <w:pict>
+              <v:roundrect w14:anchorId="51A78CDB" id="AutoShape 213" o:spid="_x0000_s1026" style="position:absolute;margin-left:9.25pt;margin-top:4.55pt;width:593.95pt;height:243.75pt;z-index:251659264;visibility:visible;mso-wrap-style:square;mso-width-percent:0;mso-height-percent:0;mso-wrap-distance-left:9pt;mso-wrap-distance-top:0;mso-wrap-distance-right:9pt;mso-wrap-distance-bottom:0;mso-position-horizontal:absolute;mso-position-horizontal-relative:margin;mso-position-vertical:absolute;mso-position-vertical-relative:text;mso-width-percent:0;mso-height-percent:0;mso-width-relative:page;mso-height-relative:page;v-text-anchor:top" arcsize="10923f" o:gfxdata="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" fillcolor="#c6d9f1" strokecolor="#f2f2f2" strokeweight="3pt">
+                <v:fill color2="#f4f7fc" focus="100%" type="gradient"/>
+                <v:shadow on="t" color="#244482" opacity=".5" offset="1pt"/>
+                <o:lock v:ext="edit" aspectratio="t"/>
+                <v:textbox>
+                  <w:txbxContent>
+                    <w:p>
+                      <w:pPr>
+                        <w:jc w:val="center"/>
+                        <w:rPr>
+                          <w:rFonts w:ascii="Aptos Black" w:hAnsi="Aptos Black"/>
+                          <w:b/>
+                          <w:bCs/>
+                          <w:sz w:val="92"/>
+                          <w:szCs w:val="92"/>
+                        </w:rPr>
+                      </w:pPr>
+                      <w:r>
+                        <w:rPr>
+                          <w:rFonts w:ascii="Aptos Black" w:hAnsi="Aptos Black"/>
+                          <w:b/>
+                          <w:bCs/>
+                          <w:sz w:val="92"/>
+                          <w:szCs w:val="92"/>
+                        </w:rPr>
+                        <w:t xml:space="preserve">{{ </w:t>
+                      </w:r>
+                      <w:proofErr w:type="spellStart"/>
+                      <w:r>
+                        <w:rPr>
+                          <w:rFonts w:ascii="Aptos Black" w:hAnsi="Aptos Black"/>
+                          <w:b/>
+                          <w:bCs/>
+                          <w:sz w:val="92"/>
+                          <w:szCs w:val="92"/>
+                        </w:rPr>
+                        <w:t>item.NAMA</w:t>
+                      </w:r>
+                      <w:proofErr w:type="spellEnd"/>
+                      <w:r>
+                        <w:rPr>
+                          <w:rFonts w:ascii="Aptos Black" w:hAnsi="Aptos Black"/>
+                          <w:b/>
+                          <w:bCs/>
+                          <w:sz w:val="92"/>
+                          <w:szCs w:val="92"/>
+                        </w:rPr>
+                        <w:t xml:space="preserve"> }}</w:t>
+                      </w:r>
+                    </w:p>
+                    <w:p>
+                      <w:pPr>
+                        <w:ind w:left="720"/>
+                        <w:rPr>
+                          <w:rFonts w:cs="Calibri"/>
+                          <w:b/>
+                          <w:bCs/>
+                          <w:sz w:val="48"/>
+                          <w:szCs w:val="48"/>
+                        </w:rPr>
+                      </w:pPr>
+                      <w:r>
+                        <w:rPr>
+                          <w:rFonts w:cs="Calibri"/>
+                          <w:b/>
+                          <w:bCs/>
+                          <w:sz w:val="48"/>
+                          <w:szCs w:val="48"/>
+                        </w:rPr>
+                        <w:t xml:space="preserve">TYPE : ..............................{{ </w:t>
+                      </w:r>
+                      <w:proofErr w:type="spellStart"/>
+                      <w:r>
+                        <w:rPr>
+                          <w:rFonts w:cs="Calibri"/>
+                          <w:b/>
+                          <w:bCs/>
+                          <w:sz w:val="48"/>
+                          <w:szCs w:val="48"/>
+                        </w:rPr>
+                        <w:t>item.TYPE</w:t>
+                      </w:r>
+                      <w:proofErr w:type="spellEnd"/>
+                      <w:r>
+                        <w:rPr>
+                          <w:rFonts w:cs="Calibri"/>
+                          <w:b/>
+                          <w:bCs/>
+                          <w:sz w:val="48"/>
+                          <w:szCs w:val="48"/>
+                        </w:rPr>
+                        <w:t xml:space="preserve"> }}..................................</w:t>
+                      </w:r>
+                    </w:p>
+                    <w:p>
+                      <w:pPr>
+                        <w:ind w:left="720"/>
+                        <w:rPr>
+                          <w:rFonts w:cs="Calibri"/>
+                          <w:b/>
+                          <w:bCs/>
+                          <w:sz w:val="48"/>
+                          <w:szCs w:val="48"/>
+                        </w:rPr>
+                      </w:pPr>
+                      <w:r>
+                        <w:rPr>
+                          <w:rFonts w:cs="Calibri"/>
+                          <w:b/>
+                          <w:bCs/>
+                          <w:sz w:val="48"/>
+                          <w:szCs w:val="48"/>
+                        </w:rPr>
+                        <w:t xml:space="preserve">LOT  : ......................... {{ </w:t>
+                      </w:r>
+                      <w:proofErr w:type="spellStart"/>
+                      <w:r>
+                        <w:rPr>
+                          <w:rFonts w:cs="Calibri"/>
+                          <w:b/>
+                          <w:bCs/>
+                          <w:sz w:val="48"/>
+                          <w:szCs w:val="48"/>
+                        </w:rPr>
+                        <w:t>item.LOT</w:t>
+                      </w:r>
+                      <w:proofErr w:type="spellEnd"/>
+                      <w:r>
+                        <w:rPr>
+                          <w:rFonts w:cs="Calibri"/>
+                          <w:b/>
+                          <w:bCs/>
+                          <w:sz w:val="48"/>
+                          <w:szCs w:val="48"/>
+                        </w:rPr>
+                        <w:t xml:space="preserve"> }}...........................</w:t>
+                      </w:r>
+                    </w:p>
+                    <w:p>
+                      <w:pPr>
+                        <w:ind w:left="720"/>
+                        <w:rPr>
+                          <w:rFonts w:cs="Calibri"/>
+                          <w:b/>
+                          <w:bCs/>
+                          <w:sz w:val="48"/>
+                          <w:szCs w:val="48"/>
+                        </w:rPr>
+                      </w:pPr>
+                      <w:r>
+                        <w:rPr>
+                          <w:rFonts w:cs="Calibri"/>
+                          <w:b/>
+                          <w:bCs/>
+                          <w:sz w:val="48"/>
+                          <w:szCs w:val="48"/>
+                        </w:rPr>
+                        <w:t>NET  : ............................... {{ item.NET }}............................ KGS</w:t>
+                      </w:r>
+                    </w:p>
+                  </w:txbxContent>
+                </v:textbox>
+                <w10:wrap anchorx="margin"/>
+              </v:roundrect>
+            </w:pict>
+          </mc:Fallback>
+        </mc:AlternateContent>
+      </w:r>
     </w:p>
     <w:sectPr>
       <w:pgSz w:w="12240" w:h="20160" w:code="5"/>
@@ -1227,6 +1300,7 @@
   <w:style w:type="character" w:default="1" w:styleId="FontParagrafDefault">
     <w:name w:val="Default Paragraph Font"/>
     <w:uiPriority w:val="1"/>
+    <w:semiHidden/>
     <w:unhideWhenUsed/>
   </w:style>
   <w:style w:type="table" w:default="1" w:styleId="TabelNormal">

</xml_diff>